<commit_message>
incomplete summary, WIP, disregard
</commit_message>
<xml_diff>
--- a/Pham_sales_analysis_summary.docx
+++ b/Pham_sales_analysis_summary.docx
@@ -526,6 +526,15 @@
         </w:rPr>
         <w:t>Consumer Report</w:t>
       </w:r>
+    </w:p>
+    <w:p>
+      <w:pPr>
+        <w:spacing w:line="240" w:lineRule="auto"/>
+        <w:rPr>
+          <w:sz w:val="32"/>
+          <w:szCs w:val="32"/>
+        </w:rPr>
+      </w:pPr>
     </w:p>
     <w:sectPr>
       <w:pgSz w:w="12240" w:h="15840"/>
@@ -656,8 +665,6 @@
     </w:r>
     <w:r>
       <w:tab/>
-    </w:r>
-    <w:r>
       <w:t>Capstone 2</w:t>
     </w:r>
     <w:r>
@@ -1271,6 +1278,7 @@
   <w:style w:type="character" w:default="1" w:styleId="DefaultParagraphFont">
     <w:name w:val="Default Paragraph Font"/>
     <w:uiPriority w:val="1"/>
+    <w:semiHidden/>
     <w:unhideWhenUsed/>
   </w:style>
   <w:style w:type="table" w:default="1" w:styleId="TableNormal">

</xml_diff>